<commit_message>
Append DD references to translated comments
</commit_message>
<xml_diff>
--- a/dd-comments-aligned-with-english.docx
+++ b/dd-comments-aligned-with-english.docx
@@ -223,7 +223,7 @@
               <w:rPr>
                 <w:sz w:val="18"/>
               </w:rPr>
-              <w:t>A Mazdayasnian testimony: druz appears as the counterpart of yazd?n.</w:t>
+              <w:t>A Mazdayasnian testimony: druz appears as the counterpart of yazd?n. (dd0.5)</w:t>
             </w:r>
           </w:p>
         </w:tc>
@@ -344,7 +344,7 @@
               <w:rPr>
                 <w:sz w:val="18"/>
               </w:rPr>
-              <w:t>Use of religious concepts to explain a historical event: the attack of druz, the reason for Islam's superiority, and the harm done to Mazdayasnians and the religion. Druz versus yazd?n; the role of religious specialists in this struggle. Religion functions as a tool for explaining the surrounding world.</w:t>
+              <w:t>Use of religious concepts to explain a historical event: the attack of druz, the reason for Islam's superiority, and the harm done to Mazdayasnians and the religion. Druz versus yazd?n; the role of religious specialists in this struggle. Religion functions as a tool for explaining the surrounding world. (dd0.8)</w:t>
             </w:r>
           </w:p>
         </w:tc>
@@ -465,7 +465,7 @@
               <w:rPr>
                 <w:sz w:val="18"/>
               </w:rPr>
-              <w:t>Man?chihr and the difficult economic conditions of the Zoroastrian community. It seems that Man?chihr was addressing complaints caused by a threefold increase in the demands of the rulers.</w:t>
+              <w:t>Man?chihr and the difficult economic conditions of the Zoroastrian community. It seems that Man?chihr was addressing complaints caused by a threefold increase in the demands of the rulers. (dd0.15)</w:t>
             </w:r>
           </w:p>
         </w:tc>
@@ -585,7 +585,7 @@
               <w:rPr>
                 <w:sz w:val="18"/>
               </w:rPr>
-              <w:t>Man?chihr's sources and method.</w:t>
+              <w:t>Man?chihr's sources and method. (dd0.18)</w:t>
             </w:r>
           </w:p>
         </w:tc>
@@ -705,7 +705,7 @@
               <w:rPr>
                 <w:sz w:val="18"/>
               </w:rPr>
-              <w:t>Man?chihr's source.</w:t>
+              <w:t>Man?chihr's source. (dd0.20)</w:t>
             </w:r>
           </w:p>
         </w:tc>
@@ -826,7 +826,7 @@
               <w:rPr>
                 <w:sz w:val="18"/>
               </w:rPr>
-              <w:t>Man?chihr presents one of his own benefits as a religious interpreter as making druz disappear. He explains that he wears the garment of truth, which most probably refers to choosing truth. In 15.0 he explains that he was solving problems caused by the increase in annual taxation and helping religious inquirers affected by this rule, and that for this reason his answers to the questions of the faithful were delayed. On the other hand, he notes that he traveled to Shiraz and found time for this work. He connects his actual activity with religious action.</w:t>
+              <w:t>Man?chihr presents one of his own benefits as a religious interpreter as making druz disappear. He explains that he wears the garment of truth, which most probably refers to choosing truth. In 15.0 he explains that he was solving problems caused by the increase in annual taxation and helping religious inquirers affected by this rule, and that for this reason his answers to the questions of the faithful were delayed. On the other hand, he notes that he traveled to Shiraz and found time for this work. He connects his actual activity with religious action. (dd0.26)</w:t>
             </w:r>
           </w:p>
         </w:tc>
@@ -947,7 +947,7 @@
               <w:rPr>
                 <w:sz w:val="18"/>
               </w:rPr>
-              <w:t>Yazd?n, Ohrmazd, and druz occur together here, with reference to war against druz. The reason for humanity's superiority over other creatures is deliberation, truth, and service to yazd?n, because it is the will of the Lord. Yazd?n are the army opposed to druz; the most righteous men confront druz, destroy it with the fravahr, and strengthen the army of yazd?n and Ohrmazd's spiritual kingship in the world. Ohrmazd is the king, yazd?n are the army commanders, and the righteous are their soldiers against druz. The passage has a military perspective and also explains methods of opposition.</w:t>
+              <w:t>Yazd?n, Ohrmazd, and druz occur together here, with reference to war against druz. The reason for humanity's superiority over other creatures is deliberation, truth, and service to yazd?n, because it is the will of the Lord. Yazd?n are the army opposed to druz; the most righteous men confront druz, destroy it with the fravahr, and strengthen the army of yazd?n and Ohrmazd's spiritual kingship in the world. Ohrmazd is the king, yazd?n are the army commanders, and the righteous are their soldiers against druz. The passage has a military perspective and also explains methods of opposition. (dd1.3)</w:t>
             </w:r>
           </w:p>
         </w:tc>
@@ -1068,7 +1068,7 @@
               <w:rPr>
                 <w:sz w:val="18"/>
               </w:rPr>
-              <w:t>Military vocabulary is again used in relation to druz. Man?chihr has updated the Mazdayasnian worldview: the faithful are soldiers of the army of yazd?n who fight against druz for Ohrmazd's kingship in the spiritual and material worlds.</w:t>
+              <w:t>Military vocabulary is again used in relation to druz. Man?chihr has updated the Mazdayasnian worldview: the faithful are soldiers of the army of yazd?n who fight against druz for Ohrmazd's kingship in the spiritual and material worlds. (dd1.5)</w:t>
             </w:r>
           </w:p>
         </w:tc>
@@ -1189,7 +1189,7 @@
               <w:rPr>
                 <w:sz w:val="18"/>
               </w:rPr>
-              <w:t>Gay?mard praised yazd?n, not Ohrmazd. The phrase pahlom mardan ahlawan in the second or third section of the first question probably refers to these primordial heroes.</w:t>
+              <w:t>Gay?mard praised yazd?n, not Ohrmazd. The phrase pahlom mardan ahlawan in the second or third section of the first question probably refers to these primordial heroes. (dd1.7)</w:t>
             </w:r>
           </w:p>
         </w:tc>
@@ -1310,7 +1310,7 @@
               <w:rPr>
                 <w:sz w:val="18"/>
               </w:rPr>
-              <w:t>In different versions of the story of these primordial heroes, druz or Ahriman may have been mentioned. In later stages you can use them for comparison.</w:t>
+              <w:t>In different versions of the story of these primordial heroes, druz or Ahriman may have been mentioned. In later stages you can use them for comparison. (dd1.7)</w:t>
             </w:r>
           </w:p>
         </w:tc>
@@ -1430,7 +1430,7 @@
               <w:rPr>
                 <w:sz w:val="18"/>
               </w:rPr>
-              <w:t>This seems to be a translation of the Avesta. It distinguishes Gann?g M?n?g from Spenta M?n?g, while also referring to druz and the Creator. Compare WZ 2.16: [...] ud ab?r?g harw abz?r az ham bun n?r?g ?n andar ?n?bi?n ? fra?egirdkird?r?h ?n ka du?men ? pad andar ?mad [...].</w:t>
+              <w:t>This seems to be a translation of the Avesta. It distinguishes Gann?g M?n?g from Spenta M?n?g, while also referring to druz and the Creator. Compare WZ 2.16: [...] ud ab?r?g harw abz?r az ham bun n?r?g ?n andar ?n?bi?n ? fra?egirdkird?r?h ?n ka du?men ? pad andar ?mad [...]. (dd1.8)</w:t>
             </w:r>
           </w:p>
         </w:tc>
@@ -1551,7 +1551,7 @@
               <w:rPr>
                 <w:sz w:val="18"/>
               </w:rPr>
-              <w:t>Praise of yazd?n, not Ohrmazd. S?shy?ns completes the resurrection. The German translation is better here. Demons similar to druz, and how they act. The English passage explains the creator/restorer of the final form, who removes druz-like demon worship and opposition to the gods, expels them from the world, and completes the final restoration.</w:t>
+              <w:t>Praise of yazd?n, not Ohrmazd. S?shy?ns completes the resurrection. The German translation is better here. Demons similar to druz, and how they act. The English passage explains the creator/restorer of the final form, who removes druz-like demon worship and opposition to the gods, expels them from the world, and completes the final restoration. (dd1.11)</w:t>
             </w:r>
           </w:p>
         </w:tc>
@@ -1672,7 +1672,7 @@
               <w:rPr>
                 <w:sz w:val="18"/>
               </w:rPr>
-              <w:t>wattar?h means 'wickedness' and is used as a grammatical term connected with Daevic vocabulary. Compare Col-Pt4 s6 and the passage on Ohrmazd, the Amahraspands, Ahriman, the demons, all druz?h and wickedness, resurrection, and the final body.</w:t>
+              <w:t>wattar?h means 'wickedness' and is used as a grammatical term connected with Daevic vocabulary. Compare Col-Pt4 s6 and the passage on Ohrmazd, the Amahraspands, Ahriman, the demons, all druz?h and wickedness, resurrection, and the final body. (dd2.7)</w:t>
             </w:r>
           </w:p>
         </w:tc>
@@ -1793,7 +1793,7 @@
               <w:rPr>
                 <w:sz w:val="18"/>
               </w:rPr>
-              <w:t>War and worship are two methods that can fulfill the Creator's will. Unlike other cases, yazd?n is not mentioned here. Search yazd?n and worship; also search d?d?r/Ohrmazd.</w:t>
+              <w:t>War and worship are two methods that can fulfill the Creator's will. Unlike other cases, yazd?n is not mentioned here. Search yazd?n and worship; also search d?d?r/Ohrmazd. (dd2.10)</w:t>
             </w:r>
           </w:p>
         </w:tc>
@@ -1914,7 +1914,7 @@
               <w:rPr>
                 <w:sz w:val="18"/>
               </w:rPr>
-              <w:t>Druz is the enemy of the Creator's creatures. In this section the intended meaning seems to be Ahriman.</w:t>
+              <w:t>Druz is the enemy of the Creator's creatures. In this section the intended meaning seems to be Ahriman. (dd2.10)</w:t>
             </w:r>
           </w:p>
         </w:tc>
@@ -2035,7 +2035,7 @@
               <w:rPr>
                 <w:sz w:val="18"/>
               </w:rPr>
-              <w:t>The material creation of Ohrmazd and reaching Gann?g M?n?g.</w:t>
+              <w:t>The material creation of Ohrmazd and reaching Gann?g M?n?g. (dd2.12)</w:t>
             </w:r>
           </w:p>
         </w:tc>
@@ -2156,7 +2156,7 @@
               <w:rPr>
                 <w:sz w:val="18"/>
               </w:rPr>
-              <w:t>Druz?h and wattar?h are presented as two states produced by Ahrimanic activities; wattar?h stands opposite to weh?h.</w:t>
+              <w:t>Druz?h and wattar?h are presented as two states produced by Ahrimanic activities; wattar?h stands opposite to weh?h. (dd2.14)</w:t>
             </w:r>
           </w:p>
         </w:tc>
@@ -2277,7 +2277,7 @@
               <w:rPr>
                 <w:sz w:val="18"/>
               </w:rPr>
-              <w:t>The religion of yazd?n, not Ohrmazd.</w:t>
+              <w:t>The religion of yazd?n, not Ohrmazd. (dd2.17)</w:t>
             </w:r>
           </w:p>
         </w:tc>
@@ -2398,7 +2398,7 @@
               <w:rPr>
                 <w:sz w:val="18"/>
               </w:rPr>
-              <w:t>Ohrmazd's main desire is the frashgird. The previous section explains that the aim of the frashgird is the flourishing of the creatures, that is, the behd?ns.</w:t>
+              <w:t>Ohrmazd's main desire is the frashgird. The previous section explains that the aim of the frashgird is the flourishing of the creatures, that is, the behd?ns. (dd2.18)</w:t>
             </w:r>
           </w:p>
         </w:tc>
@@ -2519,7 +2519,7 @@
               <w:rPr>
                 <w:sz w:val="18"/>
               </w:rPr>
-              <w:t>The historical conditions and the difficult situation of the Zoroastrian community.</w:t>
+              <w:t>The historical conditions and the difficult situation of the Zoroastrian community. (dd3.4)</w:t>
             </w:r>
           </w:p>
         </w:tc>
@@ -2640,7 +2640,7 @@
               <w:rPr>
                 <w:sz w:val="18"/>
               </w:rPr>
-              <w:t>A direct reference to the harm and fear brought upon the behd?ns by the rulers of the time. It mentions rulers and other demons; the word used for demons is also repeatedly used for druz.</w:t>
+              <w:t>A direct reference to the harm and fear brought upon the behd?ns by the rulers of the time. It mentions rulers and other demons; the word used for demons is also repeatedly used for druz. (dd4.1)</w:t>
             </w:r>
           </w:p>
         </w:tc>
@@ -2761,7 +2761,7 @@
               <w:rPr>
                 <w:sz w:val="18"/>
               </w:rPr>
-              <w:t>The difficult conditions of the Zoroastrian community.</w:t>
+              <w:t>The difficult conditions of the Zoroastrian community. (dd4.4)</w:t>
             </w:r>
           </w:p>
         </w:tc>
@@ -2882,7 +2882,7 @@
               <w:rPr>
                 <w:sz w:val="18"/>
               </w:rPr>
-              <w:t>Spiritual superiority in contrast to defeat and material an?g?h.</w:t>
+              <w:t>Spiritual superiority in contrast to defeat and material an?g?h. (dd5.2)</w:t>
             </w:r>
           </w:p>
         </w:tc>
@@ -3003,7 +3003,7 @@
               <w:rPr>
                 <w:sz w:val="18"/>
               </w:rPr>
-              <w:t>The aim of human creation and humanity's duty in the world: on the one hand the Creator's will, and on the other the disabling of druz.</w:t>
+              <w:t>The aim of human creation and humanity's duty in the world: on the one hand the Creator's will, and on the other the disabling of druz. (dd5.8)</w:t>
             </w:r>
           </w:p>
         </w:tc>
@@ -3123,7 +3123,7 @@
               <w:rPr>
                 <w:sz w:val="18"/>
               </w:rPr>
-              <w:t>In this section druz is probably Ahriman. Compare d?d?r and druz, Ohrmazd and druz, d?d?r and Ahriman, Ohrmazd and Ahriman. The next section gives a direct translation. Its Avestan equivalent should be found. For Ohrmazd and Gann?g M?n?g, the text uses d?d?r and druz.</w:t>
+              <w:t>In this section druz is probably Ahriman. Compare d?d?r and druz, Ohrmazd and druz, d?d?r and Ahriman, Ohrmazd and Ahriman. The next section gives a direct translation. Its Avestan equivalent should be found. For Ohrmazd and Gann?g M?n?g, the text uses d?d?r and druz. (dd6.2)</w:t>
             </w:r>
           </w:p>
         </w:tc>
@@ -3244,7 +3244,7 @@
               <w:rPr>
                 <w:sz w:val="18"/>
               </w:rPr>
-              <w:t>Find its Avestan text.</w:t>
+              <w:t>Find its Avestan text. (dd6.3)</w:t>
             </w:r>
           </w:p>
         </w:tc>
@@ -3365,7 +3365,7 @@
               <w:rPr>
                 <w:sz w:val="18"/>
               </w:rPr>
-              <w:t>Direct translation of the Avesta.</w:t>
+              <w:t>Direct translation of the Avesta. (dd6.8)</w:t>
             </w:r>
           </w:p>
         </w:tc>
@@ -3485,7 +3485,7 @@
               <w:rPr>
                 <w:sz w:val="18"/>
               </w:rPr>
-              <w:t>Translation of the Avesta.</w:t>
+              <w:t>Translation of the Avesta. (dd13.2)</w:t>
             </w:r>
           </w:p>
         </w:tc>
@@ -3606,7 +3606,7 @@
               <w:rPr>
                 <w:sz w:val="18"/>
               </w:rPr>
-              <w:t>Translation of the Avesta.</w:t>
+              <w:t>Translation of the Avesta. (dd13.3)</w:t>
             </w:r>
           </w:p>
         </w:tc>
@@ -3726,7 +3726,7 @@
               <w:rPr>
                 <w:sz w:val="18"/>
               </w:rPr>
-              <w:t>D?d?r and Ohrmazd occur together. Therefore the original was d?d?r Ohrmazd, but for convenience d?d?r alone could also be used. Check whether there is an Avestan version. Check the attributes of Ahriman, Gann?g M?n?g, or Ak? Manah in different texts, and whether they occur with druz. Druz occurs as an attribute of demons.</w:t>
+              <w:t>D?d?r and Ohrmazd occur together. Therefore the original was d?d?r Ohrmazd, but for convenience d?d?r alone could also be used. Check whether there is an Avestan version. Check the attributes of Ahriman, Gann?g M?n?g, or Ak? Manah in different texts, and whether they occur with druz. Druz occurs as an attribute of demons. (dd13.3)</w:t>
             </w:r>
           </w:p>
         </w:tc>
@@ -3847,7 +3847,7 @@
               <w:rPr>
                 <w:sz w:val="18"/>
               </w:rPr>
-              <w:t>The righteous and the wicked.</w:t>
+              <w:t>The righteous and the wicked. (dd14.4)</w:t>
             </w:r>
           </w:p>
         </w:tc>
@@ -3968,7 +3968,7 @@
               <w:rPr>
                 <w:sz w:val="18"/>
               </w:rPr>
-              <w:t>Death.</w:t>
+              <w:t>Death. (dd14.6)</w:t>
             </w:r>
           </w:p>
         </w:tc>
@@ -4089,7 +4089,7 @@
               <w:rPr>
                 <w:sz w:val="18"/>
               </w:rPr>
-              <w:t>The image given of the human body is interesting: the body is treated as weapon and armor, while the inner boy is considered the essential and valuable part. In describing druj and fairies, the text refers to their transformation. Perhaps, on the basis of this layered view of the human body, druz and fairies can put on bodies like armor and weapons. Military vocabulary is used again.</w:t>
+              <w:t>The image given of the human body is interesting: the body is treated as weapon and armor, while the inner boy is considered the essential and valuable part. In describing druj and fairies, the text refers to their transformation. Perhaps, on the basis of this layered view of the human body, druz and fairies can put on bodies like armor and weapons. Military vocabulary is used again. (dd15.4)</w:t>
             </w:r>
           </w:p>
         </w:tc>
@@ -4210,7 +4210,7 @@
               <w:rPr>
                 <w:sz w:val="18"/>
               </w:rPr>
-              <w:t>This is certainly not Ahriman.</w:t>
+              <w:t>This is certainly not Ahriman. (dd15.7)</w:t>
             </w:r>
           </w:p>
         </w:tc>
@@ -4331,7 +4331,7 @@
               <w:rPr>
                 <w:sz w:val="18"/>
               </w:rPr>
-              <w:t>Yazd?n are set against the demons. The demons cause the body's transformation after death, while yazd?n preserve it.</w:t>
+              <w:t>Yazd?n are set against the demons. The demons cause the body's transformation after death, while yazd?n preserve it. (dd16.2)</w:t>
             </w:r>
           </w:p>
         </w:tc>
@@ -4452,7 +4452,7 @@
               <w:rPr>
                 <w:sz w:val="18"/>
               </w:rPr>
-              <w:t>The word 'armies' may refer to the armies of yazd?n. Druz is not mentioned.</w:t>
+              <w:t>The word 'armies' may refer to the armies of yazd?n. Druz is not mentioned. (dd16.5)</w:t>
             </w:r>
           </w:p>
         </w:tc>
@@ -4572,7 +4572,7 @@
               <w:rPr>
                 <w:sz w:val="18"/>
               </w:rPr>
-              <w:t>Yazd?n also had the capacity to create, but their creation possesses fixed or passive wisdom, stardxradih. This seems to contrast with the wisdom of Ohrmazd's creatures, who harm the demons after death by imprisoning them in their bodies. This section is probably a translation because Ohrmazd is named. Was the difference between demons and drujan a matter of sphere of activity? In this case the demons trap themselves in the corpse by making it rot. This happens after death.</w:t>
+              <w:t>Yazd?n also had the capacity to create, but their creation possesses fixed or passive wisdom, stardxradih. This seems to contrast with the wisdom of Ohrmazd's creatures, who harm the demons after death by imprisoning them in their bodies. This section is probably a translation because Ohrmazd is named. Was the difference between demons and drujan a matter of sphere of activity? In this case the demons trap themselves in the corpse by making it rot. This happens after death. (dd16.14)</w:t>
             </w:r>
           </w:p>
         </w:tc>
@@ -4693,7 +4693,7 @@
               <w:rPr>
                 <w:sz w:val="18"/>
               </w:rPr>
-              <w:t>Ohrmazd and Ahriman occur together; the passage concerns the spiritual world and the afterlife. It describes the postmortem experience of the righteous and the wicked.</w:t>
+              <w:t>Ohrmazd and Ahriman occur together; the passage concerns the spiritual world and the afterlife. It describes the postmortem experience of the righteous and the wicked. (dd17.4)</w:t>
             </w:r>
           </w:p>
         </w:tc>
@@ -4814,7 +4814,7 @@
               <w:rPr>
                 <w:sz w:val="18"/>
               </w:rPr>
-              <w:t>The text completely denies a material form for Ahriman, while identifying Ohrmazd's material form with wisdom and similar powers.</w:t>
+              <w:t>The text completely denies a material form for Ahriman, while identifying Ohrmazd's material form with wisdom and similar powers. (dd18.2)</w:t>
             </w:r>
           </w:p>
         </w:tc>
@@ -4935,7 +4935,7 @@
               <w:rPr>
                 <w:sz w:val="18"/>
               </w:rPr>
-              <w:t>Translation.</w:t>
+              <w:t>Translation. (dd18.4)</w:t>
             </w:r>
           </w:p>
         </w:tc>
@@ -5056,7 +5056,7 @@
               <w:rPr>
                 <w:sz w:val="18"/>
               </w:rPr>
-              <w:t>Both Ohrmazd and d?d?r are used, but only Ahriman appears on the opposite side.</w:t>
+              <w:t>Both Ohrmazd and d?d?r are used, but only Ahriman appears on the opposite side. (dd18.5)</w:t>
             </w:r>
           </w:p>
         </w:tc>
@@ -5177,7 +5177,7 @@
               <w:rPr>
                 <w:sz w:val="18"/>
               </w:rPr>
-              <w:t>In 4.18 Zarathustra asks Ohrmazd for a helping or covenantal hand, and Ohrmazd tells him to take the hand of the man of a?a. In 6.18 the wicked are bound after death because they were deceived by Ahriman, turned away from Ohrmazd, and gave their helping hand among the druz. It seems that andar druz means 'among the druz,' not Ahriman. Since the preceding sections discuss the spiritual and material forms of Ohrmazd and Ahriman, giving the hand here has not only the implicit meaning of alliance or help but also the physical meaning of handshaking. This and similar sections show that druz is in fact Ahriman's deception, which assumes different material forms and comes into direct contact with people. In the middle, Ohrmazd also uses Zarathustra as a medium for contact with those who accept his religion, both physically through handshaking and metaphysically through help or alliance. This may be the main reason for the much more frequent use of druz instead of Ahriman, while Ohrmazd and d?d?r are used in nearly equal measure. Man?chihr knew that Ahriman has no material, physical dimension but can deceive creatures into turning away from Ohrmazd. Man?chihr lived in a period when Mazdayasnians constantly faced harm and fear from the wicked, the evil, sinners, and in general Ahriman's allies; yet he knew that Ahriman had no material dimension through which he could directly deceive individuals. He probably decided to introduce the flexible and broad Avestan concept of druz as Ahriman's material dimension in this world. Although Man?chihr does not directly say that Ohrmazd lacks a material dimension, he notes that Ohrmazd's material aspect appears as wisdom, strength, xwarrah, hospitality, and similar qualities. Shortly afterward, by inviting Zarathustra to take the hand of the man of a?a, Ohrmazd refuses to shake Zarathustra's hand, which may again allude to his lack of a material dimension or at least a physical body. Here man and dru stand in opposition: man and similar capacities are Ohrmazd's material aspect and the source of the power of his followers, the righteous; but it is clear that the wicked also had their own powers, foremost among them deception, which harmed the righteous severely. These powers are undoubtedly Ahrimanic. Man?chihr's solution is to posit a material form, druz, for Ahriman's power of deception, not for Ahriman himself. This is why he uses druz most of the time. Druz in the Avesta may in fact be Angra Mainyu; in Man?chihr's text he uses Ahuramazdaic and druzic. In this text the wicked give their hand to druz, while the men of a?a give their hand to Zarathustra; in the preceding sections Zarathustra and S?shy?ns are introduced as the two chief fighters against druz. Zarathustra is the medium transmitting Ohrmazd's religion to creatures; druz is the medium transmitting turning away from Ohrmazd's religion. One of the main problems of the Zoroastrian community was the conversion of behd?ns to Islam. In this sense, druz can be understood as the material form of Ahrimanic deception/falsehood that turns the righteous away from Ohrmazd's religion. This is why in many cases it is impossible to decide whether Man?chihr means Ahriman or druz. Spenta Mainyu/Ahura Mazda, as wisdom manifested through Zarathustra as Ohrmazd's religion, stands against Angra Mainyu/Gann?g M?n?g and druz/Ahriman, as deception and falsehood manifested through druz as turning away from religion. Lack of wisdom and the use of druz in the Avesta should be examined. Ohrmazd's material body is not complete; only wisdom, strength, and similar parts of his body are visible in the material world. For this reason Zarathustra cannot shake his hand, and people, through shaking Zarathustra's hand, who has a complete material body, and accepting Ohrmazd's religion, can see part of Ohrmazd's material body, kirbag, namely wisdom, xwarrah, hospitality, strength, and so on. By contrast, Ahriman has no material body, but he turns people away from Ohrmazd's religion through druz. Here druz functions opposite to Zarathustra: it is the material medium that allows Ahriman to deceive people and turn them away from the religion. In the preceding sections Zarathustra and S?shy?ns, as superior predecessors, directly confront druz. Were the druz created by Ahriman, just as Zarathustra is created by Ohrmazd? Here druz is very strongly druz, not Ahriman; it is probably a translation. It refers to the dialogue between Zarathustra and Ohrmazd. Their distinctive feature is the diversity of their modes of action, transformation, and assumption of different forms. From this perspective druz is the opposing force of Ahriman, with a varied material body, whose aim is to deceive the righteous and turn them away from Ohrmazd's religion. This force can be anything that stands against the behd?ns and therefore against Ohrmazd. In the spiritual world this force takes the single body of Ahriman. This is why Man?chihr and Z?dspram use druz instead of Ahriman. Unlike Ahriman, who has no material body, druz is active in different forms, as every act, person, being, or thing that stands against the religion. For this reason Boyce's view about the existence of druz before Ahriman may be correct.</w:t>
+              <w:t>In 4.18 Zarathustra asks Ohrmazd for a helping or covenantal hand, and Ohrmazd tells him to take the hand of the man of a?a. In 6.18 the wicked are bound after death because they were deceived by Ahriman, turned away from Ohrmazd, and gave their helping hand among the druz. It seems that andar druz means 'among the druz,' not Ahriman. Since the preceding sections discuss the spiritual and material forms of Ohrmazd and Ahriman, giving the hand here has not only the implicit meaning of alliance or help but also the physical meaning of handshaking. This and similar sections show that druz is in fact Ahriman's deception, which assumes different material forms and comes into direct contact with people. In the middle, Ohrmazd also uses Zarathustra as a medium for contact with those who accept his religion, both physically through handshaking and metaphysically through help or alliance. This may be the main reason for the much more frequent use of druz instead of Ahriman, while Ohrmazd and d?d?r are used in nearly equal measure. Man?chihr knew that Ahriman has no material, physical dimension but can deceive creatures into turning away from Ohrmazd. Man?chihr lived in a period when Mazdayasnians constantly faced harm and fear from the wicked, the evil, sinners, and in general Ahriman's allies; yet he knew that Ahriman had no material dimension through which he could directly deceive individuals. He probably decided to introduce the flexible and broad Avestan concept of druz as Ahriman's material dimension in this world. Although Man?chihr does not directly say that Ohrmazd lacks a material dimension, he notes that Ohrmazd's material aspect appears as wisdom, strength, xwarrah, hospitality, and similar qualities. Shortly afterward, by inviting Zarathustra to take the hand of the man of a?a, Ohrmazd refuses to shake Zarathustra's hand, which may again allude to his lack of a material dimension or at least a physical body. Here man and dru stand in opposition: man and similar capacities are Ohrmazd's material aspect and the source of the power of his followers, the righteous; but it is clear that the wicked also had their own powers, foremost among them deception, which harmed the righteous severely. These powers are undoubtedly Ahrimanic. Man?chihr's solution is to posit a material form, druz, for Ahriman's power of deception, not for Ahriman himself. This is why he uses druz most of the time. Druz in the Avesta may in fact be Angra Mainyu; in Man?chihr's text he uses Ahuramazdaic and druzic. In this text the wicked give their hand to druz, while the men of a?a give their hand to Zarathustra; in the preceding sections Zarathustra and S?shy?ns are introduced as the two chief fighters against druz. Zarathustra is the medium transmitting Ohrmazd's religion to creatures; druz is the medium transmitting turning away from Ohrmazd's religion. One of the main problems of the Zoroastrian community was the conversion of behd?ns to Islam. In this sense, druz can be understood as the material form of Ahrimanic deception/falsehood that turns the righteous away from Ohrmazd's religion. This is why in many cases it is impossible to decide whether Man?chihr means Ahriman or druz. Spenta Mainyu/Ahura Mazda, as wisdom manifested through Zarathustra as Ohrmazd's religion, stands against Angra Mainyu/Gann?g M?n?g and druz/Ahriman, as deception and falsehood manifested through druz as turning away from religion. Lack of wisdom and the use of druz in the Avesta should be examined. Ohrmazd's material body is not complete; only wisdom, strength, and similar parts of his body are visible in the material world. For this reason Zarathustra cannot shake his hand, and people, through shaking Zarathustra's hand, who has a complete material body, and accepting Ohrmazd's religion, can see part of Ohrmazd's material body, kirbag, namely wisdom, xwarrah, hospitality, strength, and so on. By contrast, Ahriman has no material body, but he turns people away from Ohrmazd's religion through druz. Here druz functions opposite to Zarathustra: it is the material medium that allows Ahriman to deceive people and turn them away from the religion. In the preceding sections Zarathustra and S?shy?ns, as superior predecessors, directly confront druz. Were the druz created by Ahriman, just as Zarathustra is created by Ohrmazd? Here druz is very strongly druz, not Ahriman; it is probably a translation. It refers to the dialogue between Zarathustra and Ohrmazd. Their distinctive feature is the diversity of their modes of action, transformation, and assumption of different forms. From this perspective druz is the opposing force of Ahriman, with a varied material body, whose aim is to deceive the righteous and turn them away from Ohrmazd's religion. This force can be anything that stands against the behd?ns and therefore against Ohrmazd. In the spiritual world this force takes the single body of Ahriman. This is why Man?chihr and Z?dspram use druz instead of Ahriman. Unlike Ahriman, who has no material body, druz is active in different forms, as every act, person, being, or thing that stands against the religion. For this reason Boyce's view about the existence of druz before Ahriman may be correct. (dd18.6)</w:t>
             </w:r>
           </w:p>
         </w:tc>
@@ -5297,7 +5297,7 @@
               <w:rPr>
                 <w:sz w:val="18"/>
               </w:rPr>
-              <w:t>An attribute of Ohrmazd.</w:t>
+              <w:t>An attribute of Ohrmazd. (dd18.6)</w:t>
             </w:r>
           </w:p>
         </w:tc>
@@ -5417,7 +5417,7 @@
               <w:rPr>
                 <w:sz w:val="18"/>
               </w:rPr>
-              <w:t>A translation, but it is not related to druz; it may later be useful for identifying the Avestan passage.</w:t>
+              <w:t>A translation, but it is not related to druz; it may later be useful for identifying the Avestan passage. (dd20.1)</w:t>
             </w:r>
           </w:p>
         </w:tc>
@@ -5538,7 +5538,7 @@
               <w:rPr>
                 <w:sz w:val="18"/>
               </w:rPr>
-              <w:t>The role of demons after death.</w:t>
+              <w:t>The role of demons after death. (dd21.5)</w:t>
             </w:r>
           </w:p>
         </w:tc>
@@ -5659,7 +5659,7 @@
               <w:rPr>
                 <w:sz w:val="18"/>
               </w:rPr>
-              <w:t>Among the list of sins of the wicked we encounter worship of druz, which seems to stand opposite to worship of yazd?n. But it may also stand opposite to worship of Ahura Mazda. In the text, worship of yazd?n is mentioned in many cases more often than worship of Ahura Mazda; statistics are needed.</w:t>
+              <w:t>Among the list of sins of the wicked we encounter worship of druz, which seems to stand opposite to worship of yazd?n. But it may also stand opposite to worship of Ahura Mazda. In the text, worship of yazd?n is mentioned in many cases more often than worship of Ahura Mazda; statistics are needed. (dd24.6)</w:t>
             </w:r>
           </w:p>
         </w:tc>
@@ -5779,7 +5779,7 @@
               <w:rPr>
                 <w:sz w:val="18"/>
               </w:rPr>
-              <w:t>In many cases Jaafari translated it as 'devil,' but it seems to have a meaning closer to 'evil,' or perhaps not. Check it in MPCD.</w:t>
+              <w:t>In many cases Jaafari translated it as 'devil,' but it seems to have a meaning closer to 'evil,' or perhaps not. Check it in MPCD. (dd26.2)</w:t>
             </w:r>
           </w:p>
         </w:tc>
@@ -5900,7 +5900,7 @@
               <w:rPr>
                 <w:sz w:val="18"/>
               </w:rPr>
-              <w:t>This is certainly not Ahriman. The dwelling place of demons and druzan in hell is the same. Since we also have the compound d?w-druz in some cases, a kind of cooperation and closeness between these two demonic principles can be sensed in relation to the other evil principles.</w:t>
+              <w:t>This is certainly not Ahriman. The dwelling place of demons and druzan in hell is the same. Since we also have the compound d?w-druz in some cases, a kind of cooperation and closeness between these two demonic principles can be sensed in relation to the other evil principles. (dd26.2)</w:t>
             </w:r>
           </w:p>
         </w:tc>
@@ -6020,7 +6020,7 @@
               <w:rPr>
                 <w:sz w:val="18"/>
               </w:rPr>
-              <w:t>Ahriman himself receives evildoers in hell, and the suffering of hell is worse than the harm inflicted by demons on the body in this world. This section points to the demons' method of harming people, which is mostly bodily. Likewise, from the names of demons in different texts, it seems that their aim is physical harm to Ohrmazd's creatures. By contrast, druz are more closely connected with deception and falsehood, which lead to harm to the soul and finally to wickedness. Boyce explains this somewhat; check it.</w:t>
+              <w:t>Ahriman himself receives evildoers in hell, and the suffering of hell is worse than the harm inflicted by demons on the body in this world. This section points to the demons' method of harming people, which is mostly bodily. Likewise, from the names of demons in different texts, it seems that their aim is physical harm to Ohrmazd's creatures. By contrast, druz are more closely connected with deception and falsehood, which lead to harm to the soul and finally to wickedness. Boyce explains this somewhat; check it. (dd26.5)</w:t>
             </w:r>
           </w:p>
         </w:tc>
@@ -6141,7 +6141,7 @@
               <w:rPr>
                 <w:sz w:val="18"/>
               </w:rPr>
-              <w:t>This is about the nature of Ohrmazd. Implicitly, one can understand that the author emphasizes Ohrmazd's spiritual dimension and that material creatures can see him through spiritual creatures. In the next section we have further explanation: Man?chihr notes that spiritual beings, through Ohrmazd's grace, have the ability to assume a material form; fire is the material form of Wahr?m, and water is the material form of another spiritual being, probably An?hit?.</w:t>
+              <w:t>This is about the nature of Ohrmazd. Implicitly, one can understand that the author emphasizes Ohrmazd's spiritual dimension and that material creatures can see him through spiritual creatures. In the next section we have further explanation: Man?chihr notes that spiritual beings, through Ohrmazd's grace, have the ability to assume a material form; fire is the material form of Wahr?m, and water is the material form of another spiritual being, probably An?hit?. (dd30.4)</w:t>
             </w:r>
           </w:p>
         </w:tc>
@@ -6261,7 +6261,7 @@
               <w:rPr>
                 <w:sz w:val="18"/>
               </w:rPr>
-              <w:t>The demon Wizarish takes the wicked person toward hell.</w:t>
+              <w:t>The demon Wizarish takes the wicked person toward hell. (dd31.3)</w:t>
             </w:r>
           </w:p>
         </w:tc>
@@ -6382,7 +6382,7 @@
               <w:rPr>
                 <w:sz w:val="18"/>
               </w:rPr>
-              <w:t>The sins from which different demons arise are completely different from the sins connected with druz. Unlike the sins related to druz, which mostly concern deception, falsehood, turning away from religion, and so on, and are hard to identify, the sins related to demons are more visible.</w:t>
+              <w:t>The sins from which different demons arise are completely different from the sins connected with druz. Unlike the sins related to druz, which mostly concern deception, falsehood, turning away from religion, and so on, and are hard to identify, the sins related to demons are more visible. (dd31.4)</w:t>
             </w:r>
           </w:p>
         </w:tc>
@@ -6502,7 +6502,7 @@
               <w:rPr>
                 <w:sz w:val="18"/>
               </w:rPr>
-              <w:t>Druz and Gann?g occur together, again suggesting that both are names of Ahriman. This is a unique case. Here the discussion concerns a person's repentance from deception and desire. Gann?g alone should also be included among the search terms.</w:t>
+              <w:t>Druz and Gann?g occur together, again suggesting that both are names of Ahriman. This is a unique case. Here the discussion concerns a person's repentance from deception and desire. Gann?g alone should also be included among the search terms. (dd31.5)</w:t>
             </w:r>
           </w:p>
         </w:tc>
@@ -6622,7 +6622,7 @@
               <w:rPr>
                 <w:sz w:val="18"/>
               </w:rPr>
-              <w:t>This is probably Ahriman. The second case, however, more closely resembles those who follow druz.</w:t>
+              <w:t>This is probably Ahriman. The second case, however, more closely resembles those who follow druz. (dd31.10)</w:t>
             </w:r>
           </w:p>
         </w:tc>
@@ -6743,7 +6743,7 @@
               <w:rPr>
                 <w:sz w:val="18"/>
               </w:rPr>
-              <w:t>Molten metal; druz and druzan occur together.</w:t>
+              <w:t>Molten metal; druz and druzan occur together. (dd31.10)</w:t>
             </w:r>
           </w:p>
         </w:tc>
@@ -6864,7 +6864,7 @@
               <w:rPr>
                 <w:sz w:val="18"/>
               </w:rPr>
-              <w:t>This question concerns the place, direction, and nature of hell. The noteworthy point is that although demons have an active role in all three directions of hell, there is no mention of the place of the druzan. This may support the hypothesis that druz is an attribute or capacity of Ahriman, standing against Ohrmazd's material attributes such as wisdom, xwarrah, hospitality, and strength, and appearing in various forms in the material world in order to turn people away from Ohrmazd's religion through trickery, falsehood, and deception. For this reason their role in the material world is stronger.</w:t>
+              <w:t>This question concerns the place, direction, and nature of hell. The noteworthy point is that although demons have an active role in all three directions of hell, there is no mention of the place of the druzan. This may support the hypothesis that druz is an attribute or capacity of Ahriman, standing against Ohrmazd's material attributes such as wisdom, xwarrah, hospitality, and strength, and appearing in various forms in the material world in order to turn people away from Ohrmazd's religion through trickery, falsehood, and deception. For this reason their role in the material world is stronger. (dd31.11)</w:t>
             </w:r>
           </w:p>
         </w:tc>
@@ -6985,7 +6985,7 @@
               <w:rPr>
                 <w:sz w:val="18"/>
               </w:rPr>
-              <w:t>In describing the location of hell, Man?chihr mentions a place called Druz-sk?n at the end of the House of Darkness, where the chiefs of the demons go; its main features are darkness and demonic character.</w:t>
+              <w:t>In describing the location of hell, Man?chihr mentions a place called Druz-sk?n at the end of the House of Darkness, where the chiefs of the demons go; its main features are darkness and demonic character. (dd32.5)</w:t>
             </w:r>
           </w:p>
         </w:tc>
@@ -7106,7 +7106,7 @@
               <w:rPr>
                 <w:sz w:val="18"/>
               </w:rPr>
-              <w:t>The place of the demons and their role after death became more prominent. Also in the next section.</w:t>
+              <w:t>The place of the demons and their role after death became more prominent. Also in the next section. (dd32.6)</w:t>
             </w:r>
           </w:p>
         </w:tc>
@@ -7227,7 +7227,7 @@
               <w:rPr>
                 <w:sz w:val="18"/>
               </w:rPr>
-              <w:t>Although this section does not directly name Ahriman's desire, the context shows that Ahriman's desire is connected with the death of all creatures, since that is the subject of the question. Here Gann?g M?n?g is mentioned, which may indicate that this section is a translation.</w:t>
+              <w:t>Although this section does not directly name Ahriman's desire, the context shows that Ahriman's desire is connected with the death of all creatures, since that is the subject of the question. Here Gann?g M?n?g is mentioned, which may indicate that this section is a translation. (dd34.2)</w:t>
             </w:r>
           </w:p>
         </w:tc>
@@ -7347,7 +7347,7 @@
               <w:rPr>
                 <w:sz w:val="18"/>
               </w:rPr>
-              <w:t>Resurrection; description of Ahriman's characteristics, his desire, and the nine-thousand-year war.</w:t>
+              <w:t>Resurrection; description of Ahriman's characteristics, his desire, and the nine-thousand-year war. (dd36.1)</w:t>
             </w:r>
           </w:p>
         </w:tc>
@@ -7468,7 +7468,7 @@
               <w:rPr>
                 <w:sz w:val="18"/>
               </w:rPr>
-              <w:t>Here druz is certainly Ahriman. According to this section, druz causes death, old age, corruption, suffering, and decay. Two attributes, darkness and evil, are used for druj; you should examine what attributes are used for Ahriman and the demons. This section also says that druz did not choose wisdom and goodness by choice, which again shows that this section refers to Ahriman and the story of his assault on the creations. The same section also appears in the Wiz?dag?h? and is a good case for comparison. It seems that because this section contains destruction and the effects of Ahriman's assault on material beings, Man?chihr used druz.</w:t>
+              <w:t>Here druz is certainly Ahriman. According to this section, druz causes death, old age, corruption, suffering, and decay. Two attributes, darkness and evil, are used for druj; you should examine what attributes are used for Ahriman and the demons. This section also says that druz did not choose wisdom and goodness by choice, which again shows that this section refers to Ahriman and the story of his assault on the creations. The same section also appears in the Wiz?dag?h? and is a good case for comparison. It seems that because this section contains destruction and the effects of Ahriman's assault on material beings, Man?chihr used druz. (dd36.4)</w:t>
             </w:r>
           </w:p>
         </w:tc>
@@ -7589,7 +7589,7 @@
               <w:rPr>
                 <w:sz w:val="18"/>
               </w:rPr>
-              <w:t>Reference to Ahriman's realm and the boundary between him and the light.</w:t>
+              <w:t>Reference to Ahriman's realm and the boundary between him and the light. (dd36.6)</w:t>
             </w:r>
           </w:p>
         </w:tc>
@@ -7710,7 +7710,7 @@
               <w:rPr>
                 <w:sz w:val="18"/>
               </w:rPr>
-              <w:t>Ahriman's view of the creatures of yazd?n is described as demonic. Since we also have the compound d?w-druz, this shows that evil principles not only become personified but are also used as abstract concepts. Another important point is the use of the compound spurr-druxtarih, which has the same root as druz itself. This description corresponds to the way the druzan act. The question is whether Ahriman's characteristics assume different material forms and act toward his will, or whether Ahriman creates them.</w:t>
+              <w:t>Ahriman's view of the creatures of yazd?n is described as demonic. Since we also have the compound d?w-druz, this shows that evil principles not only become personified but are also used as abstract concepts. Another important point is the use of the compound spurr-druxtarih, which has the same root as druz itself. This description corresponds to the way the druzan act. The question is whether Ahriman's characteristics assume different material forms and act toward his will, or whether Ahriman creates them. (dd36.7)</w:t>
             </w:r>
           </w:p>
         </w:tc>
@@ -7831,7 +7831,7 @@
               <w:rPr>
                 <w:sz w:val="18"/>
               </w:rPr>
-              <w:t>Ohrmazd does not allow Ahriman to enter the lights, which are his own place; perhaps this is why Ahriman begins to attack Ohrmazd's creatures.</w:t>
+              <w:t>Ohrmazd does not allow Ahriman to enter the lights, which are his own place; perhaps this is why Ahriman begins to attack Ohrmazd's creatures. (dd36.10)</w:t>
             </w:r>
           </w:p>
         </w:tc>
@@ -7951,7 +7951,7 @@
               <w:rPr>
                 <w:sz w:val="18"/>
               </w:rPr>
-              <w:t>Reference to Ahriman choosing evil by his own choice.</w:t>
+              <w:t>Reference to Ahriman choosing evil by his own choice. (dd36.1)</w:t>
             </w:r>
           </w:p>
         </w:tc>
@@ -8072,7 +8072,7 @@
               <w:rPr>
                 <w:sz w:val="18"/>
               </w:rPr>
-              <w:t>The eternal suffering of beings comes from Ahriman.</w:t>
+              <w:t>The eternal suffering of beings comes from Ahriman. (dd36.12)</w:t>
             </w:r>
           </w:p>
         </w:tc>
@@ -8192,7 +8192,7 @@
               <w:rPr>
                 <w:sz w:val="18"/>
               </w:rPr>
-              <w:t>The first druz is Ahriman, and the second druz is probably druz.</w:t>
+              <w:t>The first druz is Ahriman, and the second druz is probably druz. (dd36.14)</w:t>
             </w:r>
           </w:p>
         </w:tc>
@@ -8313,7 +8313,7 @@
               <w:rPr>
                 <w:sz w:val="18"/>
               </w:rPr>
-              <w:t>This is one of the few sections where Ahriman and druz occur together. Man?chihr quite deliberately uses druz instead of Ahriman, but where it is necessary to refer to druz itself, he uses the word Ahriman to avoid ambiguity. A little earlier, however, he uses druz twice in succession; the first is Ahriman and the second, which occurs together with the demons, is probably the druzan. This section describes in detail what will happen to the druzan and the demons at the resurrection, including the loss of their capacity for trickery and deceit.</w:t>
+              <w:t>This is one of the few sections where Ahriman and druz occur together. Man?chihr quite deliberately uses druz instead of Ahriman, but where it is necessary to refer to druz itself, he uses the word Ahriman to avoid ambiguity. A little earlier, however, he uses druz twice in succession; the first is Ahriman and the second, which occurs together with the demons, is probably the druzan. This section describes in detail what will happen to the druzan and the demons at the resurrection, including the loss of their capacity for trickery and deceit. (dd36.12)</w:t>
             </w:r>
           </w:p>
         </w:tc>
@@ -8434,7 +8434,7 @@
               <w:rPr>
                 <w:sz w:val="18"/>
               </w:rPr>
-              <w:t>Ahriman.</w:t>
+              <w:t>Ahriman. (dd36.15)</w:t>
             </w:r>
           </w:p>
         </w:tc>
@@ -8555,7 +8555,7 @@
               <w:rPr>
                 <w:sz w:val="18"/>
               </w:rPr>
-              <w:t>Ahriman.</w:t>
+              <w:t>Ahriman. (dd36.16)</w:t>
             </w:r>
           </w:p>
         </w:tc>
@@ -8675,7 +8675,7 @@
               <w:rPr>
                 <w:sz w:val="18"/>
               </w:rPr>
-              <w:t>Here the intended meaning is certainly Ahriman.</w:t>
+              <w:t>Here the intended meaning is certainly Ahriman. (dd36.19)</w:t>
             </w:r>
           </w:p>
         </w:tc>
@@ -8796,7 +8796,7 @@
               <w:rPr>
                 <w:sz w:val="18"/>
               </w:rPr>
-              <w:t>In the argument for why Ohrmazd accepted war with Ahriman, the boundlessness and uncontrollability of evil are raised.</w:t>
+              <w:t>In the argument for why Ohrmazd accepted war with Ahriman, the boundlessness and uncontrollability of evil are raised. (dd36.28)</w:t>
             </w:r>
           </w:p>
         </w:tc>
@@ -8917,7 +8917,7 @@
               <w:rPr>
                 <w:sz w:val="18"/>
               </w:rPr>
-              <w:t>Druz and druzan occur together; this is the story of Ahriman's attack on Ohrmazd.</w:t>
+              <w:t>Druz and druzan occur together; this is the story of Ahriman's attack on Ohrmazd. (dd36.31)</w:t>
             </w:r>
           </w:p>
         </w:tc>
@@ -9038,7 +9038,7 @@
               <w:rPr>
                 <w:sz w:val="18"/>
               </w:rPr>
-              <w:t>From the beginning of Ahriman's attack on the creatures, the druz were present alongside the other Ahrimanic beings. Although one of Ahriman's titles is 'demon of demons' (see the Iranica article on Ahriman), in our text we do not have the title 'druz of druzan.'</w:t>
+              <w:t>From the beginning of Ahriman's attack on the creatures, the druz were present alongside the other Ahrimanic beings. Although one of Ahriman's titles is 'demon of demons' (see the Iranica article on Ahriman), in our text we do not have the title 'druz of druzan.' (dd36.36)</w:t>
             </w:r>
           </w:p>
         </w:tc>
@@ -9158,7 +9158,7 @@
               <w:rPr>
                 <w:sz w:val="18"/>
               </w:rPr>
-              <w:t>In this section it seems that Ahriman and the druzan have been fused and treated as a single entity. Ahriman, through his power, commands them to overcome the xwarrah of material creatures through death and the seizure of the souls of the living. It seems that from this point Ahriman's capacity to act becomes limited and is delegated to his agents. The text emphasizes the dark essence of druz and demons, and also the dark seed of the demons, in contrast to the purity of the spiritual yazd?n. It seems to be inspired by the element of night and day, which never blend with one another.</w:t>
+              <w:t>In this section it seems that Ahriman and the druzan have been fused and treated as a single entity. Ahriman, through his power, commands them to overcome the xwarrah of material creatures through death and the seizure of the souls of the living. It seems that from this point Ahriman's capacity to act becomes limited and is delegated to his agents. The text emphasizes the dark essence of druz and demons, and also the dark seed of the demons, in contrast to the purity of the spiritual yazd?n. It seems to be inspired by the element of night and day, which never blend with one another. (dd36.36)</w:t>
             </w:r>
           </w:p>
         </w:tc>
@@ -9279,7 +9279,7 @@
               <w:rPr>
                 <w:sz w:val="18"/>
               </w:rPr>
-              <w:t>In this section it seems that Ahriman and the druzan have been fused and treated as a single entity. Ahriman, through his power, commands them to overcome the xwarrah of material creatures through death and the seizure of the souls of the living. It seems that from this point Ahriman's capacity to act becomes limited and is delegated to his agents. The text emphasizes the dark essence of druz and demons, and also the dark seed of the demons, in contrast to the purity of the spiritual yazd?n. It seems to be inspired by the element of night and day, which never blend with one another.</w:t>
+              <w:t>In this section it seems that Ahriman and the druzan have been fused and treated as a single entity. Ahriman, through his power, commands them to overcome the xwarrah of material creatures through death and the seizure of the souls of the living. It seems that from this point Ahriman's capacity to act becomes limited and is delegated to his agents. The text emphasizes the dark essence of druz and demons, and also the dark seed of the demons, in contrast to the purity of the spiritual yazd?n. It seems to be inspired by the element of night and day, which never blend with one another. (dd36.37)</w:t>
             </w:r>
           </w:p>
         </w:tc>
@@ -9400,7 +9400,7 @@
               <w:rPr>
                 <w:sz w:val="18"/>
               </w:rPr>
-              <w:t>As Boyce also notes, diseases are connected with demons. Compared with the druzan, demons are more often named and their functions are more clearly specified, perhaps because the druzan are attributes of Ahriman and in fact parts of him that have taken on a collective personality. Since harms such as fever, bodily corruption, weakness of breath, and greed are personified as demons, demons can be understood as Ahriman's weapons for destroying the living through death. In 40.36 it is explicitly stated that demons such as Zarman, evil W?y, X?shm, Zariz, Niy?z, and others, with their destructive and harmful power, are helpers of Astwih?d, who is chiefly responsible for death. On the other hand, the second weapon is the seizure of the souls of the living by drawing them into the path of wickedness; although this corresponds to descriptions of the druzan/Ahriman (source), it takes place under the leadership of dro-mihoxt. The text then explains that the demon of demons Ak?man, who accompanies Gann?g M?n?g and whose position in the hierarchy of demons is therefore high, is worse than all the demons because of his false and evil speech (41.36). Although in the preceding sections and in this section the word d?w almost always accompanies the name of a demon, here the nature of dro is not explained. Considering Darius' inscription and the description of Ak?man and his untruthful speech, falsehood can be considered Ahriman's strongest attribute, perhaps personified as a druz. The main goal of falsehood, namely making the living wicked, strengthens this hypothesis. As is clear in many sections of the D?dest?n (source), druz is repeatedly described with attributes such as deceitfulness and lack of honesty, directly connected with falsehood. The compound dro with religion, dro-d?n?h, and its opposition to ahlaw-d?n?h is another witness to the connection between dro and druj; ahlaw comes from a?a, and a?a is opposed to druj, so druj is in fact the classical concept opposed to a?a. Why in this specific case we have dro-d?n?h and ahlaw-d?n?h but elsewhere du?-d?n?h is also a topic for discussion. On the other hand, although the druzan are a group of evil beings, they are rarely introduced individually with specific names. This shows that they do not really have independent identities and are part of Ahriman with the capacity to act in the material realm.</w:t>
+              <w:t>As Boyce also notes, diseases are connected with demons. Compared with the druzan, demons are more often named and their functions are more clearly specified, perhaps because the druzan are attributes of Ahriman and in fact parts of him that have taken on a collective personality. Since harms such as fever, bodily corruption, weakness of breath, and greed are personified as demons, demons can be understood as Ahriman's weapons for destroying the living through death. In 40.36 it is explicitly stated that demons such as Zarman, evil W?y, X?shm, Zariz, Niy?z, and others, with their destructive and harmful power, are helpers of Astwih?d, who is chiefly responsible for death. On the other hand, the second weapon is the seizure of the souls of the living by drawing them into the path of wickedness; although this corresponds to descriptions of the druzan/Ahriman (source), it takes place under the leadership of dro-mihoxt. The text then explains that the demon of demons Ak?man, who accompanies Gann?g M?n?g and whose position in the hierarchy of demons is therefore high, is worse than all the demons because of his false and evil speech (41.36). Although in the preceding sections and in this section the word d?w almost always accompanies the name of a demon, here the nature of dro is not explained. Considering Darius' inscription and the description of Ak?man and his untruthful speech, falsehood can be considered Ahriman's strongest attribute, perhaps personified as a druz. The main goal of falsehood, namely making the living wicked, strengthens this hypothesis. As is clear in many sections of the D?dest?n (source), druz is repeatedly described with attributes such as deceitfulness and lack of honesty, directly connected with falsehood. The compound dro with religion, dro-d?n?h, and its opposition to ahlaw-d?n?h is another witness to the connection between dro and druj; ahlaw comes from a?a, and a?a is opposed to druj, so druj is in fact the classical concept opposed to a?a. Why in this specific case we have dro-d?n?h and ahlaw-d?n?h but elsewhere du?-d?n?h is also a topic for discussion. On the other hand, although the druzan are a group of evil beings, they are rarely introduced individually with specific names. This shows that they do not really have independent identities and are part of Ahriman with the capacity to act in the material realm. (dd36.39)</w:t>
             </w:r>
           </w:p>
         </w:tc>
@@ -9521,7 +9521,7 @@
               <w:rPr>
                 <w:sz w:val="18"/>
               </w:rPr>
-              <w:t>Check and compare the roots of lie, druz, and mihoxt.</w:t>
+              <w:t>Check and compare the roots of lie, druz, and mihoxt. (dd36.41)</w:t>
             </w:r>
           </w:p>
         </w:tc>
@@ -9642,7 +9642,7 @@
               <w:rPr>
                 <w:sz w:val="18"/>
               </w:rPr>
-              <w:t>Immediately after the lordship of falsehood for making people wicked and driving their souls to hell, we encounter the cooperation of all powerful demons in deceiving the creatures so that they follow the religion of falsehood.</w:t>
+              <w:t>Immediately after the lordship of falsehood for making people wicked and driving their souls to hell, we encounter the cooperation of all powerful demons in deceiving the creatures so that they follow the religion of falsehood. (dd36.42)</w:t>
             </w:r>
           </w:p>
         </w:tc>
@@ -9763,7 +9763,7 @@
               <w:rPr>
                 <w:sz w:val="18"/>
               </w:rPr>
-              <w:t>Although the Iranica article on Ahriman explicitly states that in the Avesta Ahriman is not presented as the creator of the demons, this section directly refers to Ahriman's creation of the demons and druzan. Then druz creates more demons and druzan in order to pollute the creatures. The word fr?h?dan here seems to be a compound of fra, 'to drive forward,' and ham, 'together, jointly.'</w:t>
+              <w:t>Although the Iranica article on Ahriman explicitly states that in the Avesta Ahriman is not presented as the creator of the demons, this section directly refers to Ahriman's creation of the demons and druzan. Then druz creates more demons and druzan in order to pollute the creatures. The word fr?h?dan here seems to be a compound of fra, 'to drive forward,' and ham, 'together, jointly.' (dd36.43)</w:t>
             </w:r>
           </w:p>
         </w:tc>
@@ -9884,7 +9884,7 @@
               <w:rPr>
                 <w:sz w:val="18"/>
               </w:rPr>
-              <w:t>The fairies are called demons. The devil dwells in them.</w:t>
+              <w:t>The fairies are called demons. The devil dwells in them. (dd36.44)</w:t>
             </w:r>
           </w:p>
         </w:tc>
@@ -10005,7 +10005,7 @@
               <w:rPr>
                 <w:sz w:val="18"/>
               </w:rPr>
-              <w:t>Druzan occur side by side with the chiefs of the demons and the demons of M?zandar?n, and it is said that they mobilize their army to destroy the lights and oppose the creatures of yazd?n. It is interesting that the reason for this enmity is not rational or utilitarian but hatred and envy, exactly like Ahriman himself, who attacked the spiritual world only out of envy toward Ohrmazd's creatures. Their manner of warfare is also described as harsh and violent. This vivid description of the reasons and methods of combat used by the chiefs of Ahriman's forces gives us a glimpse of the conditions of the ninth century as well, for which Man?chihr sought to provide a convincing explanation. In the next section he gives a detailed description of how the army of yazd?n confronts them; the noteworthy point is the emphasis on defensive action and brave, truthful, and powerful struggle. In the tense circumstances faced by the Zoroastrian community, Man?chihr as a religious leader tried to find a solution for repelling the dangers arising from contact with the Muslim community so that the Zoroastrian minority could survive. Using Mazdayasnian cosmology and eschatology, he tried to call people to endurance and defensive struggle and to keep them away from provocative reactions. The Mazdayasnian community needed hope for victory and an end to present pain and suffering, and Man?chihr, relying on one of the best-known Avestan passages, the primordial war of Ohrmazd and Ahriman, explained the logic of a dangerous world full of Ahrimanic beings and the wicked in order to increase the community's patience and endurance. He tried to mobilize the defensive force of the behd?ns not only as a religious leader but also as a political leader. The core of the war between good and evil and related themes is undoubtedly visible throughout the D?dest?n, and it undoubtedly belongs to the Avesta and the dualism of the Mazdayasnian religion, but Man?chihr did not stop there; he sought to introduce strategies of communal survival.</w:t>
+              <w:t>Druzan occur side by side with the chiefs of the demons and the demons of M?zandar?n, and it is said that they mobilize their army to destroy the lights and oppose the creatures of yazd?n. It is interesting that the reason for this enmity is not rational or utilitarian but hatred and envy, exactly like Ahriman himself, who attacked the spiritual world only out of envy toward Ohrmazd's creatures. Their manner of warfare is also described as harsh and violent. This vivid description of the reasons and methods of combat used by the chiefs of Ahriman's forces gives us a glimpse of the conditions of the ninth century as well, for which Man?chihr sought to provide a convincing explanation. In the next section he gives a detailed description of how the army of yazd?n confronts them; the noteworthy point is the emphasis on defensive action and brave, truthful, and powerful struggle. In the tense circumstances faced by the Zoroastrian community, Man?chihr as a religious leader tried to find a solution for repelling the dangers arising from contact with the Muslim community so that the Zoroastrian minority could survive. Using Mazdayasnian cosmology and eschatology, he tried to call people to endurance and defensive struggle and to keep them away from provocative reactions. The Mazdayasnian community needed hope for victory and an end to present pain and suffering, and Man?chihr, relying on one of the best-known Avestan passages, the primordial war of Ohrmazd and Ahriman, explained the logic of a dangerous world full of Ahrimanic beings and the wicked in order to increase the community's patience and endurance. He tried to mobilize the defensive force of the behd?ns not only as a religious leader but also as a political leader. The core of the war between good and evil and related themes is undoubtedly visible throughout the D?dest?n, and it undoubtedly belongs to the Avesta and the dualism of the Mazdayasnian religion, but Man?chihr did not stop there; he sought to introduce strategies of communal survival. (dd36.45)</w:t>
             </w:r>
           </w:p>
         </w:tc>

</xml_diff>